<commit_message>
REFACTOR Zombie et ZombieType
Création initiale BD, remplacement des listes par des tables en BD pour Zombie et ZombieType
</commit_message>
<xml_diff>
--- a/S04_Lab_Instructions.docx
+++ b/S04_Lab_Instructions.docx
@@ -1,6 +1,6 @@
 
 <file path=word/document.xml><?xml version="1.0" encoding="utf-8"?>
-<w:document xmlns:wpc="http://schemas.microsoft.com/office/word/2010/wordprocessingCanvas" xmlns:cx="http://schemas.microsoft.com/office/drawing/2014/chartex" xmlns:cx1="http://schemas.microsoft.com/office/drawing/2015/9/8/chartex" xmlns:cx2="http://schemas.microsoft.com/office/drawing/2015/10/21/chartex" xmlns:cx3="http://schemas.microsoft.com/office/drawing/2016/5/9/chartex" xmlns:cx4="http://schemas.microsoft.com/office/drawing/2016/5/10/chartex" xmlns:cx5="http://schemas.microsoft.com/office/drawing/2016/5/11/chartex" xmlns:cx6="http://schemas.microsoft.com/office/drawing/2016/5/12/chartex" xmlns:cx7="http://schemas.microsoft.com/office/drawing/2016/5/13/chartex" xmlns:cx8="http://schemas.microsoft.com/office/drawing/2016/5/14/chartex" xmlns:mc="http://schemas.openxmlformats.org/markup-compatibility/2006" xmlns:aink="http://schemas.microsoft.com/office/drawing/2016/ink" xmlns:am3d="http://schemas.microsoft.com/office/drawing/2017/model3d" xmlns:o="urn:schemas-microsoft-com:office:office" xmlns:oel="http://schemas.microsoft.com/office/2019/extlst" xmlns:r="http://schemas.openxmlformats.org/officeDocument/2006/relationships" xmlns:m="http://schemas.openxmlformats.org/officeDocument/2006/math" xmlns:v="urn:schemas-microsoft-com:vml" xmlns:wp14="http://schemas.microsoft.com/office/word/2010/wordprocessingDrawing" xmlns:wp="http://schemas.openxmlformats.org/drawingml/2006/wordprocessingDrawing" xmlns:w10="urn:schemas-microsoft-com:office:word" xmlns:w="http://schemas.openxmlformats.org/wordprocessingml/2006/main" xmlns:w14="http://schemas.microsoft.com/office/word/2010/wordml" xmlns:w15="http://schemas.microsoft.com/office/word/2012/wordml" xmlns:w16cex="http://schemas.microsoft.com/office/word/2018/wordml/cex" xmlns:w16cid="http://schemas.microsoft.com/office/word/2016/wordml/cid" xmlns:w16="http://schemas.microsoft.com/office/word/2018/wordml" xmlns:w16du="http://schemas.microsoft.com/office/word/2023/wordml/word16du" xmlns:w16sdtdh="http://schemas.microsoft.com/office/word/2020/wordml/sdtdatahash" xmlns:w16sdtfl="http://schemas.microsoft.com/office/word/2024/wordml/sdtformatlock" xmlns:w16se="http://schemas.microsoft.com/office/word/2015/wordml/symex" xmlns:wpg="http://schemas.microsoft.com/office/word/2010/wordprocessingGroup" xmlns:wpi="http://schemas.microsoft.com/office/word/2010/wordprocessingInk" xmlns:wne="http://schemas.microsoft.com/office/word/2006/wordml" xmlns:wps="http://schemas.microsoft.com/office/word/2010/wordprocessingShape" mc:Ignorable="w14 w15 w16se w16cid w16 w16cex w16sdtdh w16sdtfl w16du wp14">
+<w:document xmlns:wpc="http://schemas.microsoft.com/office/word/2010/wordprocessingCanvas" xmlns:cx="http://schemas.microsoft.com/office/drawing/2014/chartex" xmlns:cx1="http://schemas.microsoft.com/office/drawing/2015/9/8/chartex" xmlns:cx2="http://schemas.microsoft.com/office/drawing/2015/10/21/chartex" xmlns:cx3="http://schemas.microsoft.com/office/drawing/2016/5/9/chartex" xmlns:cx4="http://schemas.microsoft.com/office/drawing/2016/5/10/chartex" xmlns:cx5="http://schemas.microsoft.com/office/drawing/2016/5/11/chartex" xmlns:cx6="http://schemas.microsoft.com/office/drawing/2016/5/12/chartex" xmlns:cx7="http://schemas.microsoft.com/office/drawing/2016/5/13/chartex" xmlns:cx8="http://schemas.microsoft.com/office/drawing/2016/5/14/chartex" xmlns:mc="http://schemas.openxmlformats.org/markup-compatibility/2006" xmlns:aink="http://schemas.microsoft.com/office/drawing/2016/ink" xmlns:am3d="http://schemas.microsoft.com/office/drawing/2017/model3d" xmlns:o="urn:schemas-microsoft-com:office:office" xmlns:oel="http://schemas.microsoft.com/office/2019/extlst" xmlns:r="http://schemas.openxmlformats.org/officeDocument/2006/relationships" xmlns:m="http://schemas.openxmlformats.org/officeDocument/2006/math" xmlns:v="urn:schemas-microsoft-com:vml" xmlns:wp14="http://schemas.microsoft.com/office/word/2010/wordprocessingDrawing" xmlns:wp="http://schemas.openxmlformats.org/drawingml/2006/wordprocessingDrawing" xmlns:w10="urn:schemas-microsoft-com:office:word" xmlns:w="http://schemas.openxmlformats.org/wordprocessingml/2006/main" xmlns:w14="http://schemas.microsoft.com/office/word/2010/wordml" xmlns:w15="http://schemas.microsoft.com/office/word/2012/wordml" xmlns:w16cei="http://schemas.microsoft.com/office/word/2026/wordml/cei" xmlns:w16cex="http://schemas.microsoft.com/office/word/2018/wordml/cex" xmlns:w16cid="http://schemas.microsoft.com/office/word/2016/wordml/cid" xmlns:w16="http://schemas.microsoft.com/office/word/2018/wordml" xmlns:w16du="http://schemas.microsoft.com/office/word/2023/wordml/word16du" xmlns:w16sdtdh="http://schemas.microsoft.com/office/word/2020/wordml/sdtdatahash" xmlns:w16sdtfl="http://schemas.microsoft.com/office/word/2024/wordml/sdtformatlock" xmlns:w16se="http://schemas.microsoft.com/office/word/2015/wordml/symex" xmlns:wpg="http://schemas.microsoft.com/office/word/2010/wordprocessingGroup" xmlns:wpi="http://schemas.microsoft.com/office/word/2010/wordprocessingInk" xmlns:wne="http://schemas.microsoft.com/office/word/2006/wordml" xmlns:wps="http://schemas.microsoft.com/office/word/2010/wordprocessingShape" mc:Ignorable="w14 w15 w16se w16cid w16 w16cex w16sdtdh w16sdtfl w16du wp14">
   <w:background w:color="F2F2F2" w:themeColor="background1" w:themeShade="F2"/>
   <w:body>
     <w:p>
@@ -2773,21 +2773,8 @@
           <w:highlight w:val="green"/>
           <w:lang w:val="en-CA"/>
         </w:rPr>
-        <w:t>&lt;</w:t>
-      </w:r>
-      <w:proofErr w:type="spellStart"/>
-      <w:r>
-        <w:rPr>
-          <w:rFonts w:ascii="Cascadia Mono" w:hAnsi="Cascadia Mono" w:cs="Cascadia Mono"/>
-          <w:color w:val="000000"/>
-          <w:sz w:val="19"/>
-          <w:szCs w:val="19"/>
-          <w:highlight w:val="green"/>
-          <w:lang w:val="en-CA"/>
-        </w:rPr>
-        <w:t>ZombiePartyDbContext</w:t>
-      </w:r>
-      <w:proofErr w:type="spellEnd"/>
+        <w:t>&lt;ZombiePartyDbContext</w:t>
+      </w:r>
       <w:proofErr w:type="gramStart"/>
       <w:r>
         <w:rPr>
@@ -5062,7 +5049,15 @@
         <w:spacing w:before="0" w:after="160" w:line="259" w:lineRule="auto"/>
       </w:pPr>
       <w:r>
-        <w:t xml:space="preserve">Et si vous avez ce message à la place, c’est que vous avez mis les annotations sur ZombieType et non </w:t>
+        <w:t xml:space="preserve">Et si vous avez ce message à la place, c’est que vous avez mis les annotations sur </w:t>
+      </w:r>
+      <w:proofErr w:type="spellStart"/>
+      <w:r>
+        <w:t>ZombieType</w:t>
+      </w:r>
+      <w:proofErr w:type="spellEnd"/>
+      <w:r>
+        <w:t xml:space="preserve"> et non </w:t>
       </w:r>
       <w:proofErr w:type="spellStart"/>
       <w:r>
@@ -5230,8 +5225,18 @@
         </w:numPr>
         <w:spacing w:before="0" w:after="160" w:line="259" w:lineRule="auto"/>
       </w:pPr>
-      <w:r>
-        <w:t>Allez voir dans SQL Management Studio : la BD n’est pas encore là</w:t>
+      <w:proofErr w:type="spellStart"/>
+      <w:proofErr w:type="gramStart"/>
+      <w:r>
+        <w:t>update</w:t>
+      </w:r>
+      <w:r>
+        <w:t>Allez</w:t>
+      </w:r>
+      <w:proofErr w:type="spellEnd"/>
+      <w:proofErr w:type="gramEnd"/>
+      <w:r>
+        <w:t xml:space="preserve"> voir dans SQL Management Studio : la BD n’est pas encore là</w:t>
       </w:r>
       <w:r>
         <w:t>,</w:t>
@@ -9349,7 +9354,6 @@
         </w:rPr>
         <w:t xml:space="preserve"> </w:t>
       </w:r>
-      <w:proofErr w:type="spellStart"/>
       <w:r>
         <w:rPr>
           <w:rFonts w:ascii="Cascadia Mono" w:hAnsi="Cascadia Mono" w:cs="Cascadia Mono"/>
@@ -9361,7 +9365,6 @@
         </w:rPr>
         <w:t>ZombiePartyDbContext</w:t>
       </w:r>
-      <w:proofErr w:type="spellEnd"/>
       <w:r>
         <w:rPr>
           <w:rFonts w:ascii="Cascadia Mono" w:hAnsi="Cascadia Mono" w:cs="Cascadia Mono"/>
@@ -9779,20 +9782,38 @@
           <w:bCs/>
         </w:rPr>
       </w:pPr>
+      <w:proofErr w:type="spellStart"/>
       <w:r>
         <w:rPr>
           <w:b/>
           <w:bCs/>
         </w:rPr>
         <w:lastRenderedPageBreak/>
-        <w:t xml:space="preserve">ZombieType </w:t>
-      </w:r>
+        <w:t>ZombieType</w:t>
+      </w:r>
+      <w:proofErr w:type="spellEnd"/>
       <w:r>
         <w:rPr>
           <w:b/>
           <w:bCs/>
         </w:rPr>
-        <w:t xml:space="preserve">Views </w:t>
+        <w:t xml:space="preserve"> </w:t>
+      </w:r>
+      <w:proofErr w:type="spellStart"/>
+      <w:r>
+        <w:rPr>
+          <w:b/>
+          <w:bCs/>
+        </w:rPr>
+        <w:t>Views</w:t>
+      </w:r>
+      <w:proofErr w:type="spellEnd"/>
+      <w:r>
+        <w:rPr>
+          <w:b/>
+          <w:bCs/>
+        </w:rPr>
+        <w:t xml:space="preserve"> </w:t>
       </w:r>
       <w:proofErr w:type="spellStart"/>
       <w:r>
@@ -9820,7 +9841,15 @@
         </w:numPr>
       </w:pPr>
       <w:r>
-        <w:t xml:space="preserve">Ouvrez la View </w:t>
+        <w:t xml:space="preserve">Ouvrez la </w:t>
+      </w:r>
+      <w:proofErr w:type="spellStart"/>
+      <w:r>
+        <w:t>View</w:t>
+      </w:r>
+      <w:proofErr w:type="spellEnd"/>
+      <w:r>
+        <w:t xml:space="preserve"> </w:t>
       </w:r>
       <w:proofErr w:type="spellStart"/>
       <w:r>
@@ -12138,7 +12167,15 @@
         <w:t xml:space="preserve">En cas de doute, référez-vous </w:t>
       </w:r>
       <w:r>
-        <w:t xml:space="preserve">au ZombieType ou au </w:t>
+        <w:t xml:space="preserve">au </w:t>
+      </w:r>
+      <w:proofErr w:type="spellStart"/>
+      <w:r>
+        <w:t>ZombieType</w:t>
+      </w:r>
+      <w:proofErr w:type="spellEnd"/>
+      <w:r>
+        <w:t xml:space="preserve"> ou au </w:t>
       </w:r>
       <w:proofErr w:type="spellStart"/>
       <w:r>
@@ -12422,6 +12459,7 @@
           <w:color w:val="000000"/>
           <w:sz w:val="19"/>
           <w:szCs w:val="19"/>
+          <w:lang w:val="en-CA"/>
         </w:rPr>
       </w:pPr>
       <w:r>
@@ -12433,15 +12471,68 @@
         </w:rPr>
         <w:t xml:space="preserve">    </w:t>
       </w:r>
+      <w:r>
+        <w:rPr>
+          <w:rFonts w:ascii="Cascadia Mono" w:hAnsi="Cascadia Mono" w:cs="Cascadia Mono"/>
+          <w:color w:val="0000FF"/>
+          <w:sz w:val="19"/>
+          <w:szCs w:val="19"/>
+          <w:lang w:val="en-CA"/>
+        </w:rPr>
+        <w:t>public</w:t>
+      </w:r>
+      <w:r>
+        <w:rPr>
+          <w:rFonts w:ascii="Cascadia Mono" w:hAnsi="Cascadia Mono" w:cs="Cascadia Mono"/>
+          <w:color w:val="000000"/>
+          <w:sz w:val="19"/>
+          <w:szCs w:val="19"/>
+          <w:lang w:val="en-CA"/>
+        </w:rPr>
+        <w:t xml:space="preserve"> Zombie </w:t>
+      </w:r>
+      <w:proofErr w:type="spellStart"/>
+      <w:r>
+        <w:rPr>
+          <w:rFonts w:ascii="Cascadia Mono" w:hAnsi="Cascadia Mono" w:cs="Cascadia Mono"/>
+          <w:color w:val="000000"/>
+          <w:sz w:val="19"/>
+          <w:szCs w:val="19"/>
+          <w:lang w:val="en-CA"/>
+        </w:rPr>
+        <w:t>Zombie</w:t>
+      </w:r>
+      <w:proofErr w:type="spellEnd"/>
+      <w:r>
+        <w:rPr>
+          <w:rFonts w:ascii="Cascadia Mono" w:hAnsi="Cascadia Mono" w:cs="Cascadia Mono"/>
+          <w:color w:val="000000"/>
+          <w:sz w:val="19"/>
+          <w:szCs w:val="19"/>
+          <w:lang w:val="en-CA"/>
+        </w:rPr>
+        <w:t xml:space="preserve"> </w:t>
+      </w:r>
       <w:proofErr w:type="gramStart"/>
       <w:r>
         <w:rPr>
           <w:rFonts w:ascii="Cascadia Mono" w:hAnsi="Cascadia Mono" w:cs="Cascadia Mono"/>
+          <w:color w:val="000000"/>
+          <w:sz w:val="19"/>
+          <w:szCs w:val="19"/>
+          <w:lang w:val="en-CA"/>
+        </w:rPr>
+        <w:t xml:space="preserve">{ </w:t>
+      </w:r>
+      <w:r>
+        <w:rPr>
+          <w:rFonts w:ascii="Cascadia Mono" w:hAnsi="Cascadia Mono" w:cs="Cascadia Mono"/>
           <w:color w:val="0000FF"/>
           <w:sz w:val="19"/>
           <w:szCs w:val="19"/>
-        </w:rPr>
-        <w:t>public</w:t>
+          <w:lang w:val="en-CA"/>
+        </w:rPr>
+        <w:t>get</w:t>
       </w:r>
       <w:proofErr w:type="gramEnd"/>
       <w:r>
@@ -12450,28 +12541,19 @@
           <w:color w:val="000000"/>
           <w:sz w:val="19"/>
           <w:szCs w:val="19"/>
-        </w:rPr>
-        <w:t xml:space="preserve"> Zombie </w:t>
-      </w:r>
-      <w:proofErr w:type="spellStart"/>
-      <w:r>
-        <w:rPr>
-          <w:rFonts w:ascii="Cascadia Mono" w:hAnsi="Cascadia Mono" w:cs="Cascadia Mono"/>
-          <w:color w:val="000000"/>
-          <w:sz w:val="19"/>
-          <w:szCs w:val="19"/>
-        </w:rPr>
-        <w:t>Zombie</w:t>
-      </w:r>
-      <w:proofErr w:type="spellEnd"/>
-      <w:r>
-        <w:rPr>
-          <w:rFonts w:ascii="Cascadia Mono" w:hAnsi="Cascadia Mono" w:cs="Cascadia Mono"/>
-          <w:color w:val="000000"/>
-          <w:sz w:val="19"/>
-          <w:szCs w:val="19"/>
-        </w:rPr>
-        <w:t xml:space="preserve"> </w:t>
+          <w:lang w:val="en-CA"/>
+        </w:rPr>
+        <w:t xml:space="preserve">; </w:t>
+      </w:r>
+      <w:r>
+        <w:rPr>
+          <w:rFonts w:ascii="Cascadia Mono" w:hAnsi="Cascadia Mono" w:cs="Cascadia Mono"/>
+          <w:color w:val="0000FF"/>
+          <w:sz w:val="19"/>
+          <w:szCs w:val="19"/>
+          <w:lang w:val="en-CA"/>
+        </w:rPr>
+        <w:t>set</w:t>
       </w:r>
       <w:proofErr w:type="gramStart"/>
       <w:r>
@@ -12480,46 +12562,7 @@
           <w:color w:val="000000"/>
           <w:sz w:val="19"/>
           <w:szCs w:val="19"/>
-        </w:rPr>
-        <w:t xml:space="preserve">{ </w:t>
-      </w:r>
-      <w:proofErr w:type="spellStart"/>
-      <w:r>
-        <w:rPr>
-          <w:rFonts w:ascii="Cascadia Mono" w:hAnsi="Cascadia Mono" w:cs="Cascadia Mono"/>
-          <w:color w:val="0000FF"/>
-          <w:sz w:val="19"/>
-          <w:szCs w:val="19"/>
-        </w:rPr>
-        <w:t>get</w:t>
-      </w:r>
-      <w:proofErr w:type="spellEnd"/>
-      <w:proofErr w:type="gramEnd"/>
-      <w:r>
-        <w:rPr>
-          <w:rFonts w:ascii="Cascadia Mono" w:hAnsi="Cascadia Mono" w:cs="Cascadia Mono"/>
-          <w:color w:val="000000"/>
-          <w:sz w:val="19"/>
-          <w:szCs w:val="19"/>
-        </w:rPr>
-        <w:t xml:space="preserve">; </w:t>
-      </w:r>
-      <w:r>
-        <w:rPr>
-          <w:rFonts w:ascii="Cascadia Mono" w:hAnsi="Cascadia Mono" w:cs="Cascadia Mono"/>
-          <w:color w:val="0000FF"/>
-          <w:sz w:val="19"/>
-          <w:szCs w:val="19"/>
-        </w:rPr>
-        <w:t>set</w:t>
-      </w:r>
-      <w:proofErr w:type="gramStart"/>
-      <w:r>
-        <w:rPr>
-          <w:rFonts w:ascii="Cascadia Mono" w:hAnsi="Cascadia Mono" w:cs="Cascadia Mono"/>
-          <w:color w:val="000000"/>
-          <w:sz w:val="19"/>
-          <w:szCs w:val="19"/>
+          <w:lang w:val="en-CA"/>
         </w:rPr>
         <w:t>; }</w:t>
       </w:r>
@@ -12544,6 +12587,7 @@
           <w:color w:val="000000"/>
           <w:sz w:val="19"/>
           <w:szCs w:val="19"/>
+          <w:lang w:val="en-CA"/>
         </w:rPr>
       </w:pPr>
     </w:p>
@@ -12566,14 +12610,16 @@
           <w:color w:val="000000"/>
           <w:sz w:val="19"/>
           <w:szCs w:val="19"/>
-        </w:rPr>
-      </w:pPr>
-      <w:r>
-        <w:rPr>
-          <w:rFonts w:ascii="Cascadia Mono" w:hAnsi="Cascadia Mono" w:cs="Cascadia Mono"/>
-          <w:color w:val="000000"/>
-          <w:sz w:val="19"/>
-          <w:szCs w:val="19"/>
+          <w:lang w:val="en-CA"/>
+        </w:rPr>
+      </w:pPr>
+      <w:r>
+        <w:rPr>
+          <w:rFonts w:ascii="Cascadia Mono" w:hAnsi="Cascadia Mono" w:cs="Cascadia Mono"/>
+          <w:color w:val="000000"/>
+          <w:sz w:val="19"/>
+          <w:szCs w:val="19"/>
+          <w:lang w:val="en-CA"/>
         </w:rPr>
         <w:t xml:space="preserve">    </w:t>
       </w:r>
@@ -13362,7 +13408,29 @@
           <w:szCs w:val="19"/>
           <w:highlight w:val="cyan"/>
         </w:rPr>
-        <w:t xml:space="preserve"> View(</w:t>
+        <w:t xml:space="preserve"> </w:t>
+      </w:r>
+      <w:proofErr w:type="spellStart"/>
+      <w:r>
+        <w:rPr>
+          <w:rFonts w:ascii="Cascadia Mono" w:hAnsi="Cascadia Mono" w:cs="Cascadia Mono"/>
+          <w:color w:val="000000"/>
+          <w:sz w:val="19"/>
+          <w:szCs w:val="19"/>
+          <w:highlight w:val="cyan"/>
+        </w:rPr>
+        <w:t>View</w:t>
+      </w:r>
+      <w:proofErr w:type="spellEnd"/>
+      <w:r>
+        <w:rPr>
+          <w:rFonts w:ascii="Cascadia Mono" w:hAnsi="Cascadia Mono" w:cs="Cascadia Mono"/>
+          <w:color w:val="000000"/>
+          <w:sz w:val="19"/>
+          <w:szCs w:val="19"/>
+          <w:highlight w:val="cyan"/>
+        </w:rPr>
+        <w:t>(</w:t>
       </w:r>
       <w:proofErr w:type="spellStart"/>
       <w:r>
@@ -14135,27 +14203,7 @@
           <w:sz w:val="19"/>
           <w:szCs w:val="19"/>
         </w:rPr>
-        <w:t xml:space="preserve"> </w:t>
-      </w:r>
-      <w:proofErr w:type="spellStart"/>
-      <w:r>
-        <w:rPr>
-          <w:rFonts w:ascii="Cascadia Mono" w:hAnsi="Cascadia Mono" w:cs="Cascadia Mono"/>
-          <w:color w:val="A31515"/>
-          <w:sz w:val="19"/>
-          <w:szCs w:val="19"/>
-        </w:rPr>
-        <w:t>added</w:t>
-      </w:r>
-      <w:proofErr w:type="spellEnd"/>
-      <w:r>
-        <w:rPr>
-          <w:rFonts w:ascii="Cascadia Mono" w:hAnsi="Cascadia Mono" w:cs="Cascadia Mono"/>
-          <w:color w:val="A31515"/>
-          <w:sz w:val="19"/>
-          <w:szCs w:val="19"/>
-        </w:rPr>
-        <w:t>"</w:t>
+        <w:t xml:space="preserve"> added"</w:t>
       </w:r>
       <w:r>
         <w:rPr>
@@ -14466,7 +14514,29 @@
           <w:szCs w:val="19"/>
           <w:highlight w:val="magenta"/>
         </w:rPr>
-        <w:t xml:space="preserve">    ZombieType </w:t>
+        <w:t xml:space="preserve">    </w:t>
+      </w:r>
+      <w:proofErr w:type="spellStart"/>
+      <w:r>
+        <w:rPr>
+          <w:rFonts w:ascii="Cascadia Mono" w:hAnsi="Cascadia Mono" w:cs="Cascadia Mono"/>
+          <w:color w:val="000000"/>
+          <w:sz w:val="19"/>
+          <w:szCs w:val="19"/>
+          <w:highlight w:val="magenta"/>
+        </w:rPr>
+        <w:t>ZombieType</w:t>
+      </w:r>
+      <w:proofErr w:type="spellEnd"/>
+      <w:r>
+        <w:rPr>
+          <w:rFonts w:ascii="Cascadia Mono" w:hAnsi="Cascadia Mono" w:cs="Cascadia Mono"/>
+          <w:color w:val="000000"/>
+          <w:sz w:val="19"/>
+          <w:szCs w:val="19"/>
+          <w:highlight w:val="magenta"/>
+        </w:rPr>
+        <w:t xml:space="preserve"> </w:t>
       </w:r>
       <w:proofErr w:type="spellStart"/>
       <w:r>
@@ -15064,6 +15134,7 @@
         </w:rPr>
         <w:t xml:space="preserve"> </w:t>
       </w:r>
+      <w:proofErr w:type="spellStart"/>
       <w:proofErr w:type="gramStart"/>
       <w:r>
         <w:rPr>
@@ -15072,7 +15143,17 @@
           <w:sz w:val="19"/>
           <w:szCs w:val="19"/>
         </w:rPr>
-        <w:t>View(</w:t>
+        <w:t>View</w:t>
+      </w:r>
+      <w:proofErr w:type="spellEnd"/>
+      <w:r>
+        <w:rPr>
+          <w:rFonts w:ascii="Cascadia Mono" w:hAnsi="Cascadia Mono" w:cs="Cascadia Mono"/>
+          <w:color w:val="000000"/>
+          <w:sz w:val="19"/>
+          <w:szCs w:val="19"/>
+        </w:rPr>
+        <w:t>(</w:t>
       </w:r>
       <w:proofErr w:type="gramEnd"/>
       <w:r>
@@ -19449,7 +19530,7 @@
 </file>
 
 <file path=word/endnotes.xml><?xml version="1.0" encoding="utf-8"?>
-<w:endnotes xmlns:wpc="http://schemas.microsoft.com/office/word/2010/wordprocessingCanvas" xmlns:cx="http://schemas.microsoft.com/office/drawing/2014/chartex" xmlns:cx1="http://schemas.microsoft.com/office/drawing/2015/9/8/chartex" xmlns:cx2="http://schemas.microsoft.com/office/drawing/2015/10/21/chartex" xmlns:cx3="http://schemas.microsoft.com/office/drawing/2016/5/9/chartex" xmlns:cx4="http://schemas.microsoft.com/office/drawing/2016/5/10/chartex" xmlns:cx5="http://schemas.microsoft.com/office/drawing/2016/5/11/chartex" xmlns:cx6="http://schemas.microsoft.com/office/drawing/2016/5/12/chartex" xmlns:cx7="http://schemas.microsoft.com/office/drawing/2016/5/13/chartex" xmlns:cx8="http://schemas.microsoft.com/office/drawing/2016/5/14/chartex" xmlns:mc="http://schemas.openxmlformats.org/markup-compatibility/2006" xmlns:aink="http://schemas.microsoft.com/office/drawing/2016/ink" xmlns:am3d="http://schemas.microsoft.com/office/drawing/2017/model3d" xmlns:o="urn:schemas-microsoft-com:office:office" xmlns:oel="http://schemas.microsoft.com/office/2019/extlst" xmlns:r="http://schemas.openxmlformats.org/officeDocument/2006/relationships" xmlns:m="http://schemas.openxmlformats.org/officeDocument/2006/math" xmlns:v="urn:schemas-microsoft-com:vml" xmlns:wp14="http://schemas.microsoft.com/office/word/2010/wordprocessingDrawing" xmlns:wp="http://schemas.openxmlformats.org/drawingml/2006/wordprocessingDrawing" xmlns:w10="urn:schemas-microsoft-com:office:word" xmlns:w="http://schemas.openxmlformats.org/wordprocessingml/2006/main" xmlns:w14="http://schemas.microsoft.com/office/word/2010/wordml" xmlns:w15="http://schemas.microsoft.com/office/word/2012/wordml" xmlns:w16cex="http://schemas.microsoft.com/office/word/2018/wordml/cex" xmlns:w16cid="http://schemas.microsoft.com/office/word/2016/wordml/cid" xmlns:w16="http://schemas.microsoft.com/office/word/2018/wordml" xmlns:w16du="http://schemas.microsoft.com/office/word/2023/wordml/word16du" xmlns:w16sdtdh="http://schemas.microsoft.com/office/word/2020/wordml/sdtdatahash" xmlns:w16sdtfl="http://schemas.microsoft.com/office/word/2024/wordml/sdtformatlock" xmlns:w16se="http://schemas.microsoft.com/office/word/2015/wordml/symex" xmlns:wpg="http://schemas.microsoft.com/office/word/2010/wordprocessingGroup" xmlns:wpi="http://schemas.microsoft.com/office/word/2010/wordprocessingInk" xmlns:wne="http://schemas.microsoft.com/office/word/2006/wordml" xmlns:wps="http://schemas.microsoft.com/office/word/2010/wordprocessingShape" mc:Ignorable="w14 w15 w16se w16cid w16 w16cex w16sdtdh w16sdtfl w16du wp14">
+<w:endnotes xmlns:wpc="http://schemas.microsoft.com/office/word/2010/wordprocessingCanvas" xmlns:cx="http://schemas.microsoft.com/office/drawing/2014/chartex" xmlns:cx1="http://schemas.microsoft.com/office/drawing/2015/9/8/chartex" xmlns:cx2="http://schemas.microsoft.com/office/drawing/2015/10/21/chartex" xmlns:cx3="http://schemas.microsoft.com/office/drawing/2016/5/9/chartex" xmlns:cx4="http://schemas.microsoft.com/office/drawing/2016/5/10/chartex" xmlns:cx5="http://schemas.microsoft.com/office/drawing/2016/5/11/chartex" xmlns:cx6="http://schemas.microsoft.com/office/drawing/2016/5/12/chartex" xmlns:cx7="http://schemas.microsoft.com/office/drawing/2016/5/13/chartex" xmlns:cx8="http://schemas.microsoft.com/office/drawing/2016/5/14/chartex" xmlns:mc="http://schemas.openxmlformats.org/markup-compatibility/2006" xmlns:aink="http://schemas.microsoft.com/office/drawing/2016/ink" xmlns:am3d="http://schemas.microsoft.com/office/drawing/2017/model3d" xmlns:o="urn:schemas-microsoft-com:office:office" xmlns:oel="http://schemas.microsoft.com/office/2019/extlst" xmlns:r="http://schemas.openxmlformats.org/officeDocument/2006/relationships" xmlns:m="http://schemas.openxmlformats.org/officeDocument/2006/math" xmlns:v="urn:schemas-microsoft-com:vml" xmlns:wp14="http://schemas.microsoft.com/office/word/2010/wordprocessingDrawing" xmlns:wp="http://schemas.openxmlformats.org/drawingml/2006/wordprocessingDrawing" xmlns:w10="urn:schemas-microsoft-com:office:word" xmlns:w="http://schemas.openxmlformats.org/wordprocessingml/2006/main" xmlns:w14="http://schemas.microsoft.com/office/word/2010/wordml" xmlns:w15="http://schemas.microsoft.com/office/word/2012/wordml" xmlns:w16cei="http://schemas.microsoft.com/office/word/2026/wordml/cei" xmlns:w16cex="http://schemas.microsoft.com/office/word/2018/wordml/cex" xmlns:w16cid="http://schemas.microsoft.com/office/word/2016/wordml/cid" xmlns:w16="http://schemas.microsoft.com/office/word/2018/wordml" xmlns:w16du="http://schemas.microsoft.com/office/word/2023/wordml/word16du" xmlns:w16sdtdh="http://schemas.microsoft.com/office/word/2020/wordml/sdtdatahash" xmlns:w16sdtfl="http://schemas.microsoft.com/office/word/2024/wordml/sdtformatlock" xmlns:w16se="http://schemas.microsoft.com/office/word/2015/wordml/symex" xmlns:wpg="http://schemas.microsoft.com/office/word/2010/wordprocessingGroup" xmlns:wpi="http://schemas.microsoft.com/office/word/2010/wordprocessingInk" xmlns:wne="http://schemas.microsoft.com/office/word/2006/wordml" xmlns:wps="http://schemas.microsoft.com/office/word/2010/wordprocessingShape" mc:Ignorable="w14 w15 w16se w16cid w16 w16cex w16sdtdh w16sdtfl w16du wp14">
   <w:endnote w:type="separator" w:id="-1">
     <w:p>
       <w:r>
@@ -19468,7 +19549,7 @@
 </file>
 
 <file path=word/footer1.xml><?xml version="1.0" encoding="utf-8"?>
-<w:ftr xmlns:wpc="http://schemas.microsoft.com/office/word/2010/wordprocessingCanvas" xmlns:cx="http://schemas.microsoft.com/office/drawing/2014/chartex" xmlns:cx1="http://schemas.microsoft.com/office/drawing/2015/9/8/chartex" xmlns:cx2="http://schemas.microsoft.com/office/drawing/2015/10/21/chartex" xmlns:cx3="http://schemas.microsoft.com/office/drawing/2016/5/9/chartex" xmlns:cx4="http://schemas.microsoft.com/office/drawing/2016/5/10/chartex" xmlns:cx5="http://schemas.microsoft.com/office/drawing/2016/5/11/chartex" xmlns:cx6="http://schemas.microsoft.com/office/drawing/2016/5/12/chartex" xmlns:cx7="http://schemas.microsoft.com/office/drawing/2016/5/13/chartex" xmlns:cx8="http://schemas.microsoft.com/office/drawing/2016/5/14/chartex" xmlns:mc="http://schemas.openxmlformats.org/markup-compatibility/2006" xmlns:aink="http://schemas.microsoft.com/office/drawing/2016/ink" xmlns:am3d="http://schemas.microsoft.com/office/drawing/2017/model3d" xmlns:o="urn:schemas-microsoft-com:office:office" xmlns:oel="http://schemas.microsoft.com/office/2019/extlst" xmlns:r="http://schemas.openxmlformats.org/officeDocument/2006/relationships" xmlns:m="http://schemas.openxmlformats.org/officeDocument/2006/math" xmlns:v="urn:schemas-microsoft-com:vml" xmlns:wp14="http://schemas.microsoft.com/office/word/2010/wordprocessingDrawing" xmlns:wp="http://schemas.openxmlformats.org/drawingml/2006/wordprocessingDrawing" xmlns:w10="urn:schemas-microsoft-com:office:word" xmlns:w="http://schemas.openxmlformats.org/wordprocessingml/2006/main" xmlns:w14="http://schemas.microsoft.com/office/word/2010/wordml" xmlns:w15="http://schemas.microsoft.com/office/word/2012/wordml" xmlns:w16cex="http://schemas.microsoft.com/office/word/2018/wordml/cex" xmlns:w16cid="http://schemas.microsoft.com/office/word/2016/wordml/cid" xmlns:w16="http://schemas.microsoft.com/office/word/2018/wordml" xmlns:w16du="http://schemas.microsoft.com/office/word/2023/wordml/word16du" xmlns:w16sdtdh="http://schemas.microsoft.com/office/word/2020/wordml/sdtdatahash" xmlns:w16sdtfl="http://schemas.microsoft.com/office/word/2024/wordml/sdtformatlock" xmlns:w16se="http://schemas.microsoft.com/office/word/2015/wordml/symex" xmlns:wpg="http://schemas.microsoft.com/office/word/2010/wordprocessingGroup" xmlns:wpi="http://schemas.microsoft.com/office/word/2010/wordprocessingInk" xmlns:wne="http://schemas.microsoft.com/office/word/2006/wordml" xmlns:wps="http://schemas.microsoft.com/office/word/2010/wordprocessingShape" mc:Ignorable="w14 w15 w16se w16cid w16 w16cex w16sdtdh w16sdtfl w16du wp14">
+<w:ftr xmlns:wpc="http://schemas.microsoft.com/office/word/2010/wordprocessingCanvas" xmlns:cx="http://schemas.microsoft.com/office/drawing/2014/chartex" xmlns:cx1="http://schemas.microsoft.com/office/drawing/2015/9/8/chartex" xmlns:cx2="http://schemas.microsoft.com/office/drawing/2015/10/21/chartex" xmlns:cx3="http://schemas.microsoft.com/office/drawing/2016/5/9/chartex" xmlns:cx4="http://schemas.microsoft.com/office/drawing/2016/5/10/chartex" xmlns:cx5="http://schemas.microsoft.com/office/drawing/2016/5/11/chartex" xmlns:cx6="http://schemas.microsoft.com/office/drawing/2016/5/12/chartex" xmlns:cx7="http://schemas.microsoft.com/office/drawing/2016/5/13/chartex" xmlns:cx8="http://schemas.microsoft.com/office/drawing/2016/5/14/chartex" xmlns:mc="http://schemas.openxmlformats.org/markup-compatibility/2006" xmlns:aink="http://schemas.microsoft.com/office/drawing/2016/ink" xmlns:am3d="http://schemas.microsoft.com/office/drawing/2017/model3d" xmlns:o="urn:schemas-microsoft-com:office:office" xmlns:oel="http://schemas.microsoft.com/office/2019/extlst" xmlns:r="http://schemas.openxmlformats.org/officeDocument/2006/relationships" xmlns:m="http://schemas.openxmlformats.org/officeDocument/2006/math" xmlns:v="urn:schemas-microsoft-com:vml" xmlns:wp14="http://schemas.microsoft.com/office/word/2010/wordprocessingDrawing" xmlns:wp="http://schemas.openxmlformats.org/drawingml/2006/wordprocessingDrawing" xmlns:w10="urn:schemas-microsoft-com:office:word" xmlns:w="http://schemas.openxmlformats.org/wordprocessingml/2006/main" xmlns:w14="http://schemas.microsoft.com/office/word/2010/wordml" xmlns:w15="http://schemas.microsoft.com/office/word/2012/wordml" xmlns:w16cei="http://schemas.microsoft.com/office/word/2026/wordml/cei" xmlns:w16cex="http://schemas.microsoft.com/office/word/2018/wordml/cex" xmlns:w16cid="http://schemas.microsoft.com/office/word/2016/wordml/cid" xmlns:w16="http://schemas.microsoft.com/office/word/2018/wordml" xmlns:w16du="http://schemas.microsoft.com/office/word/2023/wordml/word16du" xmlns:w16sdtdh="http://schemas.microsoft.com/office/word/2020/wordml/sdtdatahash" xmlns:w16sdtfl="http://schemas.microsoft.com/office/word/2024/wordml/sdtformatlock" xmlns:w16se="http://schemas.microsoft.com/office/word/2015/wordml/symex" xmlns:wpg="http://schemas.microsoft.com/office/word/2010/wordprocessingGroup" xmlns:wpi="http://schemas.microsoft.com/office/word/2010/wordprocessingInk" xmlns:wne="http://schemas.microsoft.com/office/word/2006/wordml" xmlns:wps="http://schemas.microsoft.com/office/word/2010/wordprocessingShape" mc:Ignorable="w14 w15 w16se w16cid w16 w16cex w16sdtdh w16sdtfl w16du wp14">
   <w:p>
     <w:pPr>
       <w:pStyle w:val="Pieddepage"/>
@@ -19478,7 +19559,7 @@
 </file>
 
 <file path=word/footer2.xml><?xml version="1.0" encoding="utf-8"?>
-<w:ftr xmlns:wpc="http://schemas.microsoft.com/office/word/2010/wordprocessingCanvas" xmlns:cx="http://schemas.microsoft.com/office/drawing/2014/chartex" xmlns:cx1="http://schemas.microsoft.com/office/drawing/2015/9/8/chartex" xmlns:cx2="http://schemas.microsoft.com/office/drawing/2015/10/21/chartex" xmlns:cx3="http://schemas.microsoft.com/office/drawing/2016/5/9/chartex" xmlns:cx4="http://schemas.microsoft.com/office/drawing/2016/5/10/chartex" xmlns:cx5="http://schemas.microsoft.com/office/drawing/2016/5/11/chartex" xmlns:cx6="http://schemas.microsoft.com/office/drawing/2016/5/12/chartex" xmlns:cx7="http://schemas.microsoft.com/office/drawing/2016/5/13/chartex" xmlns:cx8="http://schemas.microsoft.com/office/drawing/2016/5/14/chartex" xmlns:mc="http://schemas.openxmlformats.org/markup-compatibility/2006" xmlns:aink="http://schemas.microsoft.com/office/drawing/2016/ink" xmlns:am3d="http://schemas.microsoft.com/office/drawing/2017/model3d" xmlns:o="urn:schemas-microsoft-com:office:office" xmlns:oel="http://schemas.microsoft.com/office/2019/extlst" xmlns:r="http://schemas.openxmlformats.org/officeDocument/2006/relationships" xmlns:m="http://schemas.openxmlformats.org/officeDocument/2006/math" xmlns:v="urn:schemas-microsoft-com:vml" xmlns:wp14="http://schemas.microsoft.com/office/word/2010/wordprocessingDrawing" xmlns:wp="http://schemas.openxmlformats.org/drawingml/2006/wordprocessingDrawing" xmlns:w10="urn:schemas-microsoft-com:office:word" xmlns:w="http://schemas.openxmlformats.org/wordprocessingml/2006/main" xmlns:w14="http://schemas.microsoft.com/office/word/2010/wordml" xmlns:w15="http://schemas.microsoft.com/office/word/2012/wordml" xmlns:w16cex="http://schemas.microsoft.com/office/word/2018/wordml/cex" xmlns:w16cid="http://schemas.microsoft.com/office/word/2016/wordml/cid" xmlns:w16="http://schemas.microsoft.com/office/word/2018/wordml" xmlns:w16du="http://schemas.microsoft.com/office/word/2023/wordml/word16du" xmlns:w16sdtdh="http://schemas.microsoft.com/office/word/2020/wordml/sdtdatahash" xmlns:w16sdtfl="http://schemas.microsoft.com/office/word/2024/wordml/sdtformatlock" xmlns:w16se="http://schemas.microsoft.com/office/word/2015/wordml/symex" xmlns:wpg="http://schemas.microsoft.com/office/word/2010/wordprocessingGroup" xmlns:wpi="http://schemas.microsoft.com/office/word/2010/wordprocessingInk" xmlns:wne="http://schemas.microsoft.com/office/word/2006/wordml" xmlns:wps="http://schemas.microsoft.com/office/word/2010/wordprocessingShape" mc:Ignorable="w14 w15 w16se w16cid w16 w16cex w16sdtdh w16sdtfl w16du wp14">
+<w:ftr xmlns:wpc="http://schemas.microsoft.com/office/word/2010/wordprocessingCanvas" xmlns:cx="http://schemas.microsoft.com/office/drawing/2014/chartex" xmlns:cx1="http://schemas.microsoft.com/office/drawing/2015/9/8/chartex" xmlns:cx2="http://schemas.microsoft.com/office/drawing/2015/10/21/chartex" xmlns:cx3="http://schemas.microsoft.com/office/drawing/2016/5/9/chartex" xmlns:cx4="http://schemas.microsoft.com/office/drawing/2016/5/10/chartex" xmlns:cx5="http://schemas.microsoft.com/office/drawing/2016/5/11/chartex" xmlns:cx6="http://schemas.microsoft.com/office/drawing/2016/5/12/chartex" xmlns:cx7="http://schemas.microsoft.com/office/drawing/2016/5/13/chartex" xmlns:cx8="http://schemas.microsoft.com/office/drawing/2016/5/14/chartex" xmlns:mc="http://schemas.openxmlformats.org/markup-compatibility/2006" xmlns:aink="http://schemas.microsoft.com/office/drawing/2016/ink" xmlns:am3d="http://schemas.microsoft.com/office/drawing/2017/model3d" xmlns:o="urn:schemas-microsoft-com:office:office" xmlns:oel="http://schemas.microsoft.com/office/2019/extlst" xmlns:r="http://schemas.openxmlformats.org/officeDocument/2006/relationships" xmlns:m="http://schemas.openxmlformats.org/officeDocument/2006/math" xmlns:v="urn:schemas-microsoft-com:vml" xmlns:wp14="http://schemas.microsoft.com/office/word/2010/wordprocessingDrawing" xmlns:wp="http://schemas.openxmlformats.org/drawingml/2006/wordprocessingDrawing" xmlns:w10="urn:schemas-microsoft-com:office:word" xmlns:w="http://schemas.openxmlformats.org/wordprocessingml/2006/main" xmlns:w14="http://schemas.microsoft.com/office/word/2010/wordml" xmlns:w15="http://schemas.microsoft.com/office/word/2012/wordml" xmlns:w16cei="http://schemas.microsoft.com/office/word/2026/wordml/cei" xmlns:w16cex="http://schemas.microsoft.com/office/word/2018/wordml/cex" xmlns:w16cid="http://schemas.microsoft.com/office/word/2016/wordml/cid" xmlns:w16="http://schemas.microsoft.com/office/word/2018/wordml" xmlns:w16du="http://schemas.microsoft.com/office/word/2023/wordml/word16du" xmlns:w16sdtdh="http://schemas.microsoft.com/office/word/2020/wordml/sdtdatahash" xmlns:w16sdtfl="http://schemas.microsoft.com/office/word/2024/wordml/sdtformatlock" xmlns:w16se="http://schemas.microsoft.com/office/word/2015/wordml/symex" xmlns:wpg="http://schemas.microsoft.com/office/word/2010/wordprocessingGroup" xmlns:wpi="http://schemas.microsoft.com/office/word/2010/wordprocessingInk" xmlns:wne="http://schemas.microsoft.com/office/word/2006/wordml" xmlns:wps="http://schemas.microsoft.com/office/word/2010/wordprocessingShape" mc:Ignorable="w14 w15 w16se w16cid w16 w16cex w16sdtdh w16sdtfl w16du wp14">
   <w:p>
     <w:pPr>
       <w:pStyle w:val="Pieddepage"/>
@@ -19531,7 +19612,7 @@
 </file>
 
 <file path=word/footer3.xml><?xml version="1.0" encoding="utf-8"?>
-<w:ftr xmlns:wpc="http://schemas.microsoft.com/office/word/2010/wordprocessingCanvas" xmlns:cx="http://schemas.microsoft.com/office/drawing/2014/chartex" xmlns:cx1="http://schemas.microsoft.com/office/drawing/2015/9/8/chartex" xmlns:cx2="http://schemas.microsoft.com/office/drawing/2015/10/21/chartex" xmlns:cx3="http://schemas.microsoft.com/office/drawing/2016/5/9/chartex" xmlns:cx4="http://schemas.microsoft.com/office/drawing/2016/5/10/chartex" xmlns:cx5="http://schemas.microsoft.com/office/drawing/2016/5/11/chartex" xmlns:cx6="http://schemas.microsoft.com/office/drawing/2016/5/12/chartex" xmlns:cx7="http://schemas.microsoft.com/office/drawing/2016/5/13/chartex" xmlns:cx8="http://schemas.microsoft.com/office/drawing/2016/5/14/chartex" xmlns:mc="http://schemas.openxmlformats.org/markup-compatibility/2006" xmlns:aink="http://schemas.microsoft.com/office/drawing/2016/ink" xmlns:am3d="http://schemas.microsoft.com/office/drawing/2017/model3d" xmlns:o="urn:schemas-microsoft-com:office:office" xmlns:oel="http://schemas.microsoft.com/office/2019/extlst" xmlns:r="http://schemas.openxmlformats.org/officeDocument/2006/relationships" xmlns:m="http://schemas.openxmlformats.org/officeDocument/2006/math" xmlns:v="urn:schemas-microsoft-com:vml" xmlns:wp14="http://schemas.microsoft.com/office/word/2010/wordprocessingDrawing" xmlns:wp="http://schemas.openxmlformats.org/drawingml/2006/wordprocessingDrawing" xmlns:w10="urn:schemas-microsoft-com:office:word" xmlns:w="http://schemas.openxmlformats.org/wordprocessingml/2006/main" xmlns:w14="http://schemas.microsoft.com/office/word/2010/wordml" xmlns:w15="http://schemas.microsoft.com/office/word/2012/wordml" xmlns:w16cex="http://schemas.microsoft.com/office/word/2018/wordml/cex" xmlns:w16cid="http://schemas.microsoft.com/office/word/2016/wordml/cid" xmlns:w16="http://schemas.microsoft.com/office/word/2018/wordml" xmlns:w16du="http://schemas.microsoft.com/office/word/2023/wordml/word16du" xmlns:w16sdtdh="http://schemas.microsoft.com/office/word/2020/wordml/sdtdatahash" xmlns:w16sdtfl="http://schemas.microsoft.com/office/word/2024/wordml/sdtformatlock" xmlns:w16se="http://schemas.microsoft.com/office/word/2015/wordml/symex" xmlns:wpg="http://schemas.microsoft.com/office/word/2010/wordprocessingGroup" xmlns:wpi="http://schemas.microsoft.com/office/word/2010/wordprocessingInk" xmlns:wne="http://schemas.microsoft.com/office/word/2006/wordml" xmlns:wps="http://schemas.microsoft.com/office/word/2010/wordprocessingShape" mc:Ignorable="w14 w15 w16se w16cid w16 w16cex w16sdtdh w16sdtfl w16du wp14">
+<w:ftr xmlns:wpc="http://schemas.microsoft.com/office/word/2010/wordprocessingCanvas" xmlns:cx="http://schemas.microsoft.com/office/drawing/2014/chartex" xmlns:cx1="http://schemas.microsoft.com/office/drawing/2015/9/8/chartex" xmlns:cx2="http://schemas.microsoft.com/office/drawing/2015/10/21/chartex" xmlns:cx3="http://schemas.microsoft.com/office/drawing/2016/5/9/chartex" xmlns:cx4="http://schemas.microsoft.com/office/drawing/2016/5/10/chartex" xmlns:cx5="http://schemas.microsoft.com/office/drawing/2016/5/11/chartex" xmlns:cx6="http://schemas.microsoft.com/office/drawing/2016/5/12/chartex" xmlns:cx7="http://schemas.microsoft.com/office/drawing/2016/5/13/chartex" xmlns:cx8="http://schemas.microsoft.com/office/drawing/2016/5/14/chartex" xmlns:mc="http://schemas.openxmlformats.org/markup-compatibility/2006" xmlns:aink="http://schemas.microsoft.com/office/drawing/2016/ink" xmlns:am3d="http://schemas.microsoft.com/office/drawing/2017/model3d" xmlns:o="urn:schemas-microsoft-com:office:office" xmlns:oel="http://schemas.microsoft.com/office/2019/extlst" xmlns:r="http://schemas.openxmlformats.org/officeDocument/2006/relationships" xmlns:m="http://schemas.openxmlformats.org/officeDocument/2006/math" xmlns:v="urn:schemas-microsoft-com:vml" xmlns:wp14="http://schemas.microsoft.com/office/word/2010/wordprocessingDrawing" xmlns:wp="http://schemas.openxmlformats.org/drawingml/2006/wordprocessingDrawing" xmlns:w10="urn:schemas-microsoft-com:office:word" xmlns:w="http://schemas.openxmlformats.org/wordprocessingml/2006/main" xmlns:w14="http://schemas.microsoft.com/office/word/2010/wordml" xmlns:w15="http://schemas.microsoft.com/office/word/2012/wordml" xmlns:w16cei="http://schemas.microsoft.com/office/word/2026/wordml/cei" xmlns:w16cex="http://schemas.microsoft.com/office/word/2018/wordml/cex" xmlns:w16cid="http://schemas.microsoft.com/office/word/2016/wordml/cid" xmlns:w16="http://schemas.microsoft.com/office/word/2018/wordml" xmlns:w16du="http://schemas.microsoft.com/office/word/2023/wordml/word16du" xmlns:w16sdtdh="http://schemas.microsoft.com/office/word/2020/wordml/sdtdatahash" xmlns:w16sdtfl="http://schemas.microsoft.com/office/word/2024/wordml/sdtformatlock" xmlns:w16se="http://schemas.microsoft.com/office/word/2015/wordml/symex" xmlns:wpg="http://schemas.microsoft.com/office/word/2010/wordprocessingGroup" xmlns:wpi="http://schemas.microsoft.com/office/word/2010/wordprocessingInk" xmlns:wne="http://schemas.microsoft.com/office/word/2006/wordml" xmlns:wps="http://schemas.microsoft.com/office/word/2010/wordprocessingShape" mc:Ignorable="w14 w15 w16se w16cid w16 w16cex w16sdtdh w16sdtfl w16du wp14">
   <w:p>
     <w:pPr>
       <w:pStyle w:val="Pieddepage"/>
@@ -19541,7 +19622,7 @@
 </file>
 
 <file path=word/footnotes.xml><?xml version="1.0" encoding="utf-8"?>
-<w:footnotes xmlns:wpc="http://schemas.microsoft.com/office/word/2010/wordprocessingCanvas" xmlns:cx="http://schemas.microsoft.com/office/drawing/2014/chartex" xmlns:cx1="http://schemas.microsoft.com/office/drawing/2015/9/8/chartex" xmlns:cx2="http://schemas.microsoft.com/office/drawing/2015/10/21/chartex" xmlns:cx3="http://schemas.microsoft.com/office/drawing/2016/5/9/chartex" xmlns:cx4="http://schemas.microsoft.com/office/drawing/2016/5/10/chartex" xmlns:cx5="http://schemas.microsoft.com/office/drawing/2016/5/11/chartex" xmlns:cx6="http://schemas.microsoft.com/office/drawing/2016/5/12/chartex" xmlns:cx7="http://schemas.microsoft.com/office/drawing/2016/5/13/chartex" xmlns:cx8="http://schemas.microsoft.com/office/drawing/2016/5/14/chartex" xmlns:mc="http://schemas.openxmlformats.org/markup-compatibility/2006" xmlns:aink="http://schemas.microsoft.com/office/drawing/2016/ink" xmlns:am3d="http://schemas.microsoft.com/office/drawing/2017/model3d" xmlns:o="urn:schemas-microsoft-com:office:office" xmlns:oel="http://schemas.microsoft.com/office/2019/extlst" xmlns:r="http://schemas.openxmlformats.org/officeDocument/2006/relationships" xmlns:m="http://schemas.openxmlformats.org/officeDocument/2006/math" xmlns:v="urn:schemas-microsoft-com:vml" xmlns:wp14="http://schemas.microsoft.com/office/word/2010/wordprocessingDrawing" xmlns:wp="http://schemas.openxmlformats.org/drawingml/2006/wordprocessingDrawing" xmlns:w10="urn:schemas-microsoft-com:office:word" xmlns:w="http://schemas.openxmlformats.org/wordprocessingml/2006/main" xmlns:w14="http://schemas.microsoft.com/office/word/2010/wordml" xmlns:w15="http://schemas.microsoft.com/office/word/2012/wordml" xmlns:w16cex="http://schemas.microsoft.com/office/word/2018/wordml/cex" xmlns:w16cid="http://schemas.microsoft.com/office/word/2016/wordml/cid" xmlns:w16="http://schemas.microsoft.com/office/word/2018/wordml" xmlns:w16du="http://schemas.microsoft.com/office/word/2023/wordml/word16du" xmlns:w16sdtdh="http://schemas.microsoft.com/office/word/2020/wordml/sdtdatahash" xmlns:w16sdtfl="http://schemas.microsoft.com/office/word/2024/wordml/sdtformatlock" xmlns:w16se="http://schemas.microsoft.com/office/word/2015/wordml/symex" xmlns:wpg="http://schemas.microsoft.com/office/word/2010/wordprocessingGroup" xmlns:wpi="http://schemas.microsoft.com/office/word/2010/wordprocessingInk" xmlns:wne="http://schemas.microsoft.com/office/word/2006/wordml" xmlns:wps="http://schemas.microsoft.com/office/word/2010/wordprocessingShape" mc:Ignorable="w14 w15 w16se w16cid w16 w16cex w16sdtdh w16sdtfl w16du wp14">
+<w:footnotes xmlns:wpc="http://schemas.microsoft.com/office/word/2010/wordprocessingCanvas" xmlns:cx="http://schemas.microsoft.com/office/drawing/2014/chartex" xmlns:cx1="http://schemas.microsoft.com/office/drawing/2015/9/8/chartex" xmlns:cx2="http://schemas.microsoft.com/office/drawing/2015/10/21/chartex" xmlns:cx3="http://schemas.microsoft.com/office/drawing/2016/5/9/chartex" xmlns:cx4="http://schemas.microsoft.com/office/drawing/2016/5/10/chartex" xmlns:cx5="http://schemas.microsoft.com/office/drawing/2016/5/11/chartex" xmlns:cx6="http://schemas.microsoft.com/office/drawing/2016/5/12/chartex" xmlns:cx7="http://schemas.microsoft.com/office/drawing/2016/5/13/chartex" xmlns:cx8="http://schemas.microsoft.com/office/drawing/2016/5/14/chartex" xmlns:mc="http://schemas.openxmlformats.org/markup-compatibility/2006" xmlns:aink="http://schemas.microsoft.com/office/drawing/2016/ink" xmlns:am3d="http://schemas.microsoft.com/office/drawing/2017/model3d" xmlns:o="urn:schemas-microsoft-com:office:office" xmlns:oel="http://schemas.microsoft.com/office/2019/extlst" xmlns:r="http://schemas.openxmlformats.org/officeDocument/2006/relationships" xmlns:m="http://schemas.openxmlformats.org/officeDocument/2006/math" xmlns:v="urn:schemas-microsoft-com:vml" xmlns:wp14="http://schemas.microsoft.com/office/word/2010/wordprocessingDrawing" xmlns:wp="http://schemas.openxmlformats.org/drawingml/2006/wordprocessingDrawing" xmlns:w10="urn:schemas-microsoft-com:office:word" xmlns:w="http://schemas.openxmlformats.org/wordprocessingml/2006/main" xmlns:w14="http://schemas.microsoft.com/office/word/2010/wordml" xmlns:w15="http://schemas.microsoft.com/office/word/2012/wordml" xmlns:w16cei="http://schemas.microsoft.com/office/word/2026/wordml/cei" xmlns:w16cex="http://schemas.microsoft.com/office/word/2018/wordml/cex" xmlns:w16cid="http://schemas.microsoft.com/office/word/2016/wordml/cid" xmlns:w16="http://schemas.microsoft.com/office/word/2018/wordml" xmlns:w16du="http://schemas.microsoft.com/office/word/2023/wordml/word16du" xmlns:w16sdtdh="http://schemas.microsoft.com/office/word/2020/wordml/sdtdatahash" xmlns:w16sdtfl="http://schemas.microsoft.com/office/word/2024/wordml/sdtformatlock" xmlns:w16se="http://schemas.microsoft.com/office/word/2015/wordml/symex" xmlns:wpg="http://schemas.microsoft.com/office/word/2010/wordprocessingGroup" xmlns:wpi="http://schemas.microsoft.com/office/word/2010/wordprocessingInk" xmlns:wne="http://schemas.microsoft.com/office/word/2006/wordml" xmlns:wps="http://schemas.microsoft.com/office/word/2010/wordprocessingShape" mc:Ignorable="w14 w15 w16se w16cid w16 w16cex w16sdtdh w16sdtfl w16du wp14">
   <w:footnote w:type="separator" w:id="-1">
     <w:p>
       <w:r>
@@ -19560,7 +19641,7 @@
 </file>
 
 <file path=word/header1.xml><?xml version="1.0" encoding="utf-8"?>
-<w:hdr xmlns:wpc="http://schemas.microsoft.com/office/word/2010/wordprocessingCanvas" xmlns:cx="http://schemas.microsoft.com/office/drawing/2014/chartex" xmlns:cx1="http://schemas.microsoft.com/office/drawing/2015/9/8/chartex" xmlns:cx2="http://schemas.microsoft.com/office/drawing/2015/10/21/chartex" xmlns:cx3="http://schemas.microsoft.com/office/drawing/2016/5/9/chartex" xmlns:cx4="http://schemas.microsoft.com/office/drawing/2016/5/10/chartex" xmlns:cx5="http://schemas.microsoft.com/office/drawing/2016/5/11/chartex" xmlns:cx6="http://schemas.microsoft.com/office/drawing/2016/5/12/chartex" xmlns:cx7="http://schemas.microsoft.com/office/drawing/2016/5/13/chartex" xmlns:cx8="http://schemas.microsoft.com/office/drawing/2016/5/14/chartex" xmlns:mc="http://schemas.openxmlformats.org/markup-compatibility/2006" xmlns:aink="http://schemas.microsoft.com/office/drawing/2016/ink" xmlns:am3d="http://schemas.microsoft.com/office/drawing/2017/model3d" xmlns:o="urn:schemas-microsoft-com:office:office" xmlns:oel="http://schemas.microsoft.com/office/2019/extlst" xmlns:r="http://schemas.openxmlformats.org/officeDocument/2006/relationships" xmlns:m="http://schemas.openxmlformats.org/officeDocument/2006/math" xmlns:v="urn:schemas-microsoft-com:vml" xmlns:wp14="http://schemas.microsoft.com/office/word/2010/wordprocessingDrawing" xmlns:wp="http://schemas.openxmlformats.org/drawingml/2006/wordprocessingDrawing" xmlns:w10="urn:schemas-microsoft-com:office:word" xmlns:w="http://schemas.openxmlformats.org/wordprocessingml/2006/main" xmlns:w14="http://schemas.microsoft.com/office/word/2010/wordml" xmlns:w15="http://schemas.microsoft.com/office/word/2012/wordml" xmlns:w16cex="http://schemas.microsoft.com/office/word/2018/wordml/cex" xmlns:w16cid="http://schemas.microsoft.com/office/word/2016/wordml/cid" xmlns:w16="http://schemas.microsoft.com/office/word/2018/wordml" xmlns:w16du="http://schemas.microsoft.com/office/word/2023/wordml/word16du" xmlns:w16sdtdh="http://schemas.microsoft.com/office/word/2020/wordml/sdtdatahash" xmlns:w16sdtfl="http://schemas.microsoft.com/office/word/2024/wordml/sdtformatlock" xmlns:w16se="http://schemas.microsoft.com/office/word/2015/wordml/symex" xmlns:wpg="http://schemas.microsoft.com/office/word/2010/wordprocessingGroup" xmlns:wpi="http://schemas.microsoft.com/office/word/2010/wordprocessingInk" xmlns:wne="http://schemas.microsoft.com/office/word/2006/wordml" xmlns:wps="http://schemas.microsoft.com/office/word/2010/wordprocessingShape" mc:Ignorable="w14 w15 w16se w16cid w16 w16cex w16sdtdh w16sdtfl w16du wp14">
+<w:hdr xmlns:wpc="http://schemas.microsoft.com/office/word/2010/wordprocessingCanvas" xmlns:cx="http://schemas.microsoft.com/office/drawing/2014/chartex" xmlns:cx1="http://schemas.microsoft.com/office/drawing/2015/9/8/chartex" xmlns:cx2="http://schemas.microsoft.com/office/drawing/2015/10/21/chartex" xmlns:cx3="http://schemas.microsoft.com/office/drawing/2016/5/9/chartex" xmlns:cx4="http://schemas.microsoft.com/office/drawing/2016/5/10/chartex" xmlns:cx5="http://schemas.microsoft.com/office/drawing/2016/5/11/chartex" xmlns:cx6="http://schemas.microsoft.com/office/drawing/2016/5/12/chartex" xmlns:cx7="http://schemas.microsoft.com/office/drawing/2016/5/13/chartex" xmlns:cx8="http://schemas.microsoft.com/office/drawing/2016/5/14/chartex" xmlns:mc="http://schemas.openxmlformats.org/markup-compatibility/2006" xmlns:aink="http://schemas.microsoft.com/office/drawing/2016/ink" xmlns:am3d="http://schemas.microsoft.com/office/drawing/2017/model3d" xmlns:o="urn:schemas-microsoft-com:office:office" xmlns:oel="http://schemas.microsoft.com/office/2019/extlst" xmlns:r="http://schemas.openxmlformats.org/officeDocument/2006/relationships" xmlns:m="http://schemas.openxmlformats.org/officeDocument/2006/math" xmlns:v="urn:schemas-microsoft-com:vml" xmlns:wp14="http://schemas.microsoft.com/office/word/2010/wordprocessingDrawing" xmlns:wp="http://schemas.openxmlformats.org/drawingml/2006/wordprocessingDrawing" xmlns:w10="urn:schemas-microsoft-com:office:word" xmlns:w="http://schemas.openxmlformats.org/wordprocessingml/2006/main" xmlns:w14="http://schemas.microsoft.com/office/word/2010/wordml" xmlns:w15="http://schemas.microsoft.com/office/word/2012/wordml" xmlns:w16cei="http://schemas.microsoft.com/office/word/2026/wordml/cei" xmlns:w16cex="http://schemas.microsoft.com/office/word/2018/wordml/cex" xmlns:w16cid="http://schemas.microsoft.com/office/word/2016/wordml/cid" xmlns:w16="http://schemas.microsoft.com/office/word/2018/wordml" xmlns:w16du="http://schemas.microsoft.com/office/word/2023/wordml/word16du" xmlns:w16sdtdh="http://schemas.microsoft.com/office/word/2020/wordml/sdtdatahash" xmlns:w16sdtfl="http://schemas.microsoft.com/office/word/2024/wordml/sdtformatlock" xmlns:w16se="http://schemas.microsoft.com/office/word/2015/wordml/symex" xmlns:wpg="http://schemas.microsoft.com/office/word/2010/wordprocessingGroup" xmlns:wpi="http://schemas.microsoft.com/office/word/2010/wordprocessingInk" xmlns:wne="http://schemas.microsoft.com/office/word/2006/wordml" xmlns:wps="http://schemas.microsoft.com/office/word/2010/wordprocessingShape" mc:Ignorable="w14 w15 w16se w16cid w16 w16cex w16sdtdh w16sdtfl w16du wp14">
   <w:p>
     <w:pPr>
       <w:pStyle w:val="En-tte"/>
@@ -19570,7 +19651,7 @@
 </file>
 
 <file path=word/header2.xml><?xml version="1.0" encoding="utf-8"?>
-<w:hdr xmlns:wpc="http://schemas.microsoft.com/office/word/2010/wordprocessingCanvas" xmlns:cx="http://schemas.microsoft.com/office/drawing/2014/chartex" xmlns:cx1="http://schemas.microsoft.com/office/drawing/2015/9/8/chartex" xmlns:cx2="http://schemas.microsoft.com/office/drawing/2015/10/21/chartex" xmlns:cx3="http://schemas.microsoft.com/office/drawing/2016/5/9/chartex" xmlns:cx4="http://schemas.microsoft.com/office/drawing/2016/5/10/chartex" xmlns:cx5="http://schemas.microsoft.com/office/drawing/2016/5/11/chartex" xmlns:cx6="http://schemas.microsoft.com/office/drawing/2016/5/12/chartex" xmlns:cx7="http://schemas.microsoft.com/office/drawing/2016/5/13/chartex" xmlns:cx8="http://schemas.microsoft.com/office/drawing/2016/5/14/chartex" xmlns:mc="http://schemas.openxmlformats.org/markup-compatibility/2006" xmlns:aink="http://schemas.microsoft.com/office/drawing/2016/ink" xmlns:am3d="http://schemas.microsoft.com/office/drawing/2017/model3d" xmlns:o="urn:schemas-microsoft-com:office:office" xmlns:oel="http://schemas.microsoft.com/office/2019/extlst" xmlns:r="http://schemas.openxmlformats.org/officeDocument/2006/relationships" xmlns:m="http://schemas.openxmlformats.org/officeDocument/2006/math" xmlns:v="urn:schemas-microsoft-com:vml" xmlns:wp14="http://schemas.microsoft.com/office/word/2010/wordprocessingDrawing" xmlns:wp="http://schemas.openxmlformats.org/drawingml/2006/wordprocessingDrawing" xmlns:w10="urn:schemas-microsoft-com:office:word" xmlns:w="http://schemas.openxmlformats.org/wordprocessingml/2006/main" xmlns:w14="http://schemas.microsoft.com/office/word/2010/wordml" xmlns:w15="http://schemas.microsoft.com/office/word/2012/wordml" xmlns:w16cex="http://schemas.microsoft.com/office/word/2018/wordml/cex" xmlns:w16cid="http://schemas.microsoft.com/office/word/2016/wordml/cid" xmlns:w16="http://schemas.microsoft.com/office/word/2018/wordml" xmlns:w16du="http://schemas.microsoft.com/office/word/2023/wordml/word16du" xmlns:w16sdtdh="http://schemas.microsoft.com/office/word/2020/wordml/sdtdatahash" xmlns:w16sdtfl="http://schemas.microsoft.com/office/word/2024/wordml/sdtformatlock" xmlns:w16se="http://schemas.microsoft.com/office/word/2015/wordml/symex" xmlns:wpg="http://schemas.microsoft.com/office/word/2010/wordprocessingGroup" xmlns:wpi="http://schemas.microsoft.com/office/word/2010/wordprocessingInk" xmlns:wne="http://schemas.microsoft.com/office/word/2006/wordml" xmlns:wps="http://schemas.microsoft.com/office/word/2010/wordprocessingShape" mc:Ignorable="w14 w15 w16se w16cid w16 w16cex w16sdtdh w16sdtfl w16du wp14">
+<w:hdr xmlns:wpc="http://schemas.microsoft.com/office/word/2010/wordprocessingCanvas" xmlns:cx="http://schemas.microsoft.com/office/drawing/2014/chartex" xmlns:cx1="http://schemas.microsoft.com/office/drawing/2015/9/8/chartex" xmlns:cx2="http://schemas.microsoft.com/office/drawing/2015/10/21/chartex" xmlns:cx3="http://schemas.microsoft.com/office/drawing/2016/5/9/chartex" xmlns:cx4="http://schemas.microsoft.com/office/drawing/2016/5/10/chartex" xmlns:cx5="http://schemas.microsoft.com/office/drawing/2016/5/11/chartex" xmlns:cx6="http://schemas.microsoft.com/office/drawing/2016/5/12/chartex" xmlns:cx7="http://schemas.microsoft.com/office/drawing/2016/5/13/chartex" xmlns:cx8="http://schemas.microsoft.com/office/drawing/2016/5/14/chartex" xmlns:mc="http://schemas.openxmlformats.org/markup-compatibility/2006" xmlns:aink="http://schemas.microsoft.com/office/drawing/2016/ink" xmlns:am3d="http://schemas.microsoft.com/office/drawing/2017/model3d" xmlns:o="urn:schemas-microsoft-com:office:office" xmlns:oel="http://schemas.microsoft.com/office/2019/extlst" xmlns:r="http://schemas.openxmlformats.org/officeDocument/2006/relationships" xmlns:m="http://schemas.openxmlformats.org/officeDocument/2006/math" xmlns:v="urn:schemas-microsoft-com:vml" xmlns:wp14="http://schemas.microsoft.com/office/word/2010/wordprocessingDrawing" xmlns:wp="http://schemas.openxmlformats.org/drawingml/2006/wordprocessingDrawing" xmlns:w10="urn:schemas-microsoft-com:office:word" xmlns:w="http://schemas.openxmlformats.org/wordprocessingml/2006/main" xmlns:w14="http://schemas.microsoft.com/office/word/2010/wordml" xmlns:w15="http://schemas.microsoft.com/office/word/2012/wordml" xmlns:w16cei="http://schemas.microsoft.com/office/word/2026/wordml/cei" xmlns:w16cex="http://schemas.microsoft.com/office/word/2018/wordml/cex" xmlns:w16cid="http://schemas.microsoft.com/office/word/2016/wordml/cid" xmlns:w16="http://schemas.microsoft.com/office/word/2018/wordml" xmlns:w16du="http://schemas.microsoft.com/office/word/2023/wordml/word16du" xmlns:w16sdtdh="http://schemas.microsoft.com/office/word/2020/wordml/sdtdatahash" xmlns:w16sdtfl="http://schemas.microsoft.com/office/word/2024/wordml/sdtformatlock" xmlns:w16se="http://schemas.microsoft.com/office/word/2015/wordml/symex" xmlns:wpg="http://schemas.microsoft.com/office/word/2010/wordprocessingGroup" xmlns:wpi="http://schemas.microsoft.com/office/word/2010/wordprocessingInk" xmlns:wne="http://schemas.microsoft.com/office/word/2006/wordml" xmlns:wps="http://schemas.microsoft.com/office/word/2010/wordprocessingShape" mc:Ignorable="w14 w15 w16se w16cid w16 w16cex w16sdtdh w16sdtfl w16du wp14">
   <w:p>
     <w:pPr>
       <w:pStyle w:val="En-tte"/>
@@ -19614,7 +19695,7 @@
 </file>
 
 <file path=word/header3.xml><?xml version="1.0" encoding="utf-8"?>
-<w:hdr xmlns:wpc="http://schemas.microsoft.com/office/word/2010/wordprocessingCanvas" xmlns:cx="http://schemas.microsoft.com/office/drawing/2014/chartex" xmlns:cx1="http://schemas.microsoft.com/office/drawing/2015/9/8/chartex" xmlns:cx2="http://schemas.microsoft.com/office/drawing/2015/10/21/chartex" xmlns:cx3="http://schemas.microsoft.com/office/drawing/2016/5/9/chartex" xmlns:cx4="http://schemas.microsoft.com/office/drawing/2016/5/10/chartex" xmlns:cx5="http://schemas.microsoft.com/office/drawing/2016/5/11/chartex" xmlns:cx6="http://schemas.microsoft.com/office/drawing/2016/5/12/chartex" xmlns:cx7="http://schemas.microsoft.com/office/drawing/2016/5/13/chartex" xmlns:cx8="http://schemas.microsoft.com/office/drawing/2016/5/14/chartex" xmlns:mc="http://schemas.openxmlformats.org/markup-compatibility/2006" xmlns:aink="http://schemas.microsoft.com/office/drawing/2016/ink" xmlns:am3d="http://schemas.microsoft.com/office/drawing/2017/model3d" xmlns:o="urn:schemas-microsoft-com:office:office" xmlns:oel="http://schemas.microsoft.com/office/2019/extlst" xmlns:r="http://schemas.openxmlformats.org/officeDocument/2006/relationships" xmlns:m="http://schemas.openxmlformats.org/officeDocument/2006/math" xmlns:v="urn:schemas-microsoft-com:vml" xmlns:wp14="http://schemas.microsoft.com/office/word/2010/wordprocessingDrawing" xmlns:wp="http://schemas.openxmlformats.org/drawingml/2006/wordprocessingDrawing" xmlns:w10="urn:schemas-microsoft-com:office:word" xmlns:w="http://schemas.openxmlformats.org/wordprocessingml/2006/main" xmlns:w14="http://schemas.microsoft.com/office/word/2010/wordml" xmlns:w15="http://schemas.microsoft.com/office/word/2012/wordml" xmlns:w16cex="http://schemas.microsoft.com/office/word/2018/wordml/cex" xmlns:w16cid="http://schemas.microsoft.com/office/word/2016/wordml/cid" xmlns:w16="http://schemas.microsoft.com/office/word/2018/wordml" xmlns:w16du="http://schemas.microsoft.com/office/word/2023/wordml/word16du" xmlns:w16sdtdh="http://schemas.microsoft.com/office/word/2020/wordml/sdtdatahash" xmlns:w16sdtfl="http://schemas.microsoft.com/office/word/2024/wordml/sdtformatlock" xmlns:w16se="http://schemas.microsoft.com/office/word/2015/wordml/symex" xmlns:wpg="http://schemas.microsoft.com/office/word/2010/wordprocessingGroup" xmlns:wpi="http://schemas.microsoft.com/office/word/2010/wordprocessingInk" xmlns:wne="http://schemas.microsoft.com/office/word/2006/wordml" xmlns:wps="http://schemas.microsoft.com/office/word/2010/wordprocessingShape" mc:Ignorable="w14 w15 w16se w16cid w16 w16cex w16sdtdh w16sdtfl w16du wp14">
+<w:hdr xmlns:wpc="http://schemas.microsoft.com/office/word/2010/wordprocessingCanvas" xmlns:cx="http://schemas.microsoft.com/office/drawing/2014/chartex" xmlns:cx1="http://schemas.microsoft.com/office/drawing/2015/9/8/chartex" xmlns:cx2="http://schemas.microsoft.com/office/drawing/2015/10/21/chartex" xmlns:cx3="http://schemas.microsoft.com/office/drawing/2016/5/9/chartex" xmlns:cx4="http://schemas.microsoft.com/office/drawing/2016/5/10/chartex" xmlns:cx5="http://schemas.microsoft.com/office/drawing/2016/5/11/chartex" xmlns:cx6="http://schemas.microsoft.com/office/drawing/2016/5/12/chartex" xmlns:cx7="http://schemas.microsoft.com/office/drawing/2016/5/13/chartex" xmlns:cx8="http://schemas.microsoft.com/office/drawing/2016/5/14/chartex" xmlns:mc="http://schemas.openxmlformats.org/markup-compatibility/2006" xmlns:aink="http://schemas.microsoft.com/office/drawing/2016/ink" xmlns:am3d="http://schemas.microsoft.com/office/drawing/2017/model3d" xmlns:o="urn:schemas-microsoft-com:office:office" xmlns:oel="http://schemas.microsoft.com/office/2019/extlst" xmlns:r="http://schemas.openxmlformats.org/officeDocument/2006/relationships" xmlns:m="http://schemas.openxmlformats.org/officeDocument/2006/math" xmlns:v="urn:schemas-microsoft-com:vml" xmlns:wp14="http://schemas.microsoft.com/office/word/2010/wordprocessingDrawing" xmlns:wp="http://schemas.openxmlformats.org/drawingml/2006/wordprocessingDrawing" xmlns:w10="urn:schemas-microsoft-com:office:word" xmlns:w="http://schemas.openxmlformats.org/wordprocessingml/2006/main" xmlns:w14="http://schemas.microsoft.com/office/word/2010/wordml" xmlns:w15="http://schemas.microsoft.com/office/word/2012/wordml" xmlns:w16cei="http://schemas.microsoft.com/office/word/2026/wordml/cei" xmlns:w16cex="http://schemas.microsoft.com/office/word/2018/wordml/cex" xmlns:w16cid="http://schemas.microsoft.com/office/word/2016/wordml/cid" xmlns:w16="http://schemas.microsoft.com/office/word/2018/wordml" xmlns:w16du="http://schemas.microsoft.com/office/word/2023/wordml/word16du" xmlns:w16sdtdh="http://schemas.microsoft.com/office/word/2020/wordml/sdtdatahash" xmlns:w16sdtfl="http://schemas.microsoft.com/office/word/2024/wordml/sdtformatlock" xmlns:w16se="http://schemas.microsoft.com/office/word/2015/wordml/symex" xmlns:wpg="http://schemas.microsoft.com/office/word/2010/wordprocessingGroup" xmlns:wpi="http://schemas.microsoft.com/office/word/2010/wordprocessingInk" xmlns:wne="http://schemas.microsoft.com/office/word/2006/wordml" xmlns:wps="http://schemas.microsoft.com/office/word/2010/wordprocessingShape" mc:Ignorable="w14 w15 w16se w16cid w16 w16cex w16sdtdh w16sdtfl w16du wp14">
   <w:p>
     <w:pPr>
       <w:pStyle w:val="En-tte"/>
@@ -19624,7 +19705,7 @@
 </file>
 
 <file path=word/numbering.xml><?xml version="1.0" encoding="utf-8"?>
-<w:numbering xmlns:wpc="http://schemas.microsoft.com/office/word/2010/wordprocessingCanvas" xmlns:cx="http://schemas.microsoft.com/office/drawing/2014/chartex" xmlns:cx1="http://schemas.microsoft.com/office/drawing/2015/9/8/chartex" xmlns:cx2="http://schemas.microsoft.com/office/drawing/2015/10/21/chartex" xmlns:cx3="http://schemas.microsoft.com/office/drawing/2016/5/9/chartex" xmlns:cx4="http://schemas.microsoft.com/office/drawing/2016/5/10/chartex" xmlns:cx5="http://schemas.microsoft.com/office/drawing/2016/5/11/chartex" xmlns:cx6="http://schemas.microsoft.com/office/drawing/2016/5/12/chartex" xmlns:cx7="http://schemas.microsoft.com/office/drawing/2016/5/13/chartex" xmlns:cx8="http://schemas.microsoft.com/office/drawing/2016/5/14/chartex" xmlns:mc="http://schemas.openxmlformats.org/markup-compatibility/2006" xmlns:aink="http://schemas.microsoft.com/office/drawing/2016/ink" xmlns:am3d="http://schemas.microsoft.com/office/drawing/2017/model3d" xmlns:o="urn:schemas-microsoft-com:office:office" xmlns:oel="http://schemas.microsoft.com/office/2019/extlst" xmlns:r="http://schemas.openxmlformats.org/officeDocument/2006/relationships" xmlns:m="http://schemas.openxmlformats.org/officeDocument/2006/math" xmlns:v="urn:schemas-microsoft-com:vml" xmlns:wp14="http://schemas.microsoft.com/office/word/2010/wordprocessingDrawing" xmlns:wp="http://schemas.openxmlformats.org/drawingml/2006/wordprocessingDrawing" xmlns:w10="urn:schemas-microsoft-com:office:word" xmlns:w="http://schemas.openxmlformats.org/wordprocessingml/2006/main" xmlns:w14="http://schemas.microsoft.com/office/word/2010/wordml" xmlns:w15="http://schemas.microsoft.com/office/word/2012/wordml" xmlns:w16cex="http://schemas.microsoft.com/office/word/2018/wordml/cex" xmlns:w16cid="http://schemas.microsoft.com/office/word/2016/wordml/cid" xmlns:w16="http://schemas.microsoft.com/office/word/2018/wordml" xmlns:w16du="http://schemas.microsoft.com/office/word/2023/wordml/word16du" xmlns:w16sdtdh="http://schemas.microsoft.com/office/word/2020/wordml/sdtdatahash" xmlns:w16sdtfl="http://schemas.microsoft.com/office/word/2024/wordml/sdtformatlock" xmlns:w16se="http://schemas.microsoft.com/office/word/2015/wordml/symex" xmlns:wpg="http://schemas.microsoft.com/office/word/2010/wordprocessingGroup" xmlns:wpi="http://schemas.microsoft.com/office/word/2010/wordprocessingInk" xmlns:wne="http://schemas.microsoft.com/office/word/2006/wordml" xmlns:wps="http://schemas.microsoft.com/office/word/2010/wordprocessingShape" mc:Ignorable="w14 w15 w16se w16cid w16 w16cex w16sdtdh w16sdtfl w16du wp14">
+<w:numbering xmlns:wpc="http://schemas.microsoft.com/office/word/2010/wordprocessingCanvas" xmlns:cx="http://schemas.microsoft.com/office/drawing/2014/chartex" xmlns:cx1="http://schemas.microsoft.com/office/drawing/2015/9/8/chartex" xmlns:cx2="http://schemas.microsoft.com/office/drawing/2015/10/21/chartex" xmlns:cx3="http://schemas.microsoft.com/office/drawing/2016/5/9/chartex" xmlns:cx4="http://schemas.microsoft.com/office/drawing/2016/5/10/chartex" xmlns:cx5="http://schemas.microsoft.com/office/drawing/2016/5/11/chartex" xmlns:cx6="http://schemas.microsoft.com/office/drawing/2016/5/12/chartex" xmlns:cx7="http://schemas.microsoft.com/office/drawing/2016/5/13/chartex" xmlns:cx8="http://schemas.microsoft.com/office/drawing/2016/5/14/chartex" xmlns:mc="http://schemas.openxmlformats.org/markup-compatibility/2006" xmlns:aink="http://schemas.microsoft.com/office/drawing/2016/ink" xmlns:am3d="http://schemas.microsoft.com/office/drawing/2017/model3d" xmlns:o="urn:schemas-microsoft-com:office:office" xmlns:oel="http://schemas.microsoft.com/office/2019/extlst" xmlns:r="http://schemas.openxmlformats.org/officeDocument/2006/relationships" xmlns:m="http://schemas.openxmlformats.org/officeDocument/2006/math" xmlns:v="urn:schemas-microsoft-com:vml" xmlns:wp14="http://schemas.microsoft.com/office/word/2010/wordprocessingDrawing" xmlns:wp="http://schemas.openxmlformats.org/drawingml/2006/wordprocessingDrawing" xmlns:w10="urn:schemas-microsoft-com:office:word" xmlns:w="http://schemas.openxmlformats.org/wordprocessingml/2006/main" xmlns:w14="http://schemas.microsoft.com/office/word/2010/wordml" xmlns:w15="http://schemas.microsoft.com/office/word/2012/wordml" xmlns:w16cei="http://schemas.microsoft.com/office/word/2026/wordml/cei" xmlns:w16cex="http://schemas.microsoft.com/office/word/2018/wordml/cex" xmlns:w16cid="http://schemas.microsoft.com/office/word/2016/wordml/cid" xmlns:w16="http://schemas.microsoft.com/office/word/2018/wordml" xmlns:w16du="http://schemas.microsoft.com/office/word/2023/wordml/word16du" xmlns:w16sdtdh="http://schemas.microsoft.com/office/word/2020/wordml/sdtdatahash" xmlns:w16sdtfl="http://schemas.microsoft.com/office/word/2024/wordml/sdtformatlock" xmlns:w16se="http://schemas.microsoft.com/office/word/2015/wordml/symex" xmlns:wpg="http://schemas.microsoft.com/office/word/2010/wordprocessingGroup" xmlns:wpi="http://schemas.microsoft.com/office/word/2010/wordprocessingInk" xmlns:wne="http://schemas.microsoft.com/office/word/2006/wordml" xmlns:wps="http://schemas.microsoft.com/office/word/2010/wordprocessingShape" mc:Ignorable="w14 w15 w16se w16cid w16 w16cex w16sdtdh w16sdtfl w16du wp14">
   <w:abstractNum w:abstractNumId="0" w15:restartNumberingAfterBreak="0">
     <w:nsid w:val="005C7D1D"/>
     <w:multiLevelType w:val="hybridMultilevel"/>
@@ -24526,6 +24607,7 @@
   <w:style w:type="character" w:default="1" w:styleId="Policepardfaut">
     <w:name w:val="Default Paragraph Font"/>
     <w:uiPriority w:val="1"/>
+    <w:semiHidden/>
     <w:unhideWhenUsed/>
   </w:style>
   <w:style w:type="table" w:default="1" w:styleId="TableauNormal">
@@ -25497,6 +25579,12 @@
 </file>
 
 <file path=customXml/item2.xml><?xml version="1.0" encoding="utf-8"?>
+<p:properties xmlns:p="http://schemas.microsoft.com/office/2006/metadata/properties" xmlns:xsi="http://www.w3.org/2001/XMLSchema-instance" xmlns:pc="http://schemas.microsoft.com/office/infopath/2007/PartnerControls">
+  <documentManagement/>
+</p:properties>
+</file>
+
+<file path=customXml/item3.xml><?xml version="1.0" encoding="utf-8"?>
 <ct:contentTypeSchema xmlns:ct="http://schemas.microsoft.com/office/2006/metadata/contentType" xmlns:ma="http://schemas.microsoft.com/office/2006/metadata/properties/metaAttributes" ct:_="" ma:_="" ma:contentTypeName="Document" ma:contentTypeID="0x010100354AEAE9FD62D747A26A546E5B1B5735" ma:contentTypeVersion="7" ma:contentTypeDescription="Crée un document." ma:contentTypeScope="" ma:versionID="43b763fe9aa20b7a2976a5e019d82dbf">
   <xsd:schema xmlns:xsd="http://www.w3.org/2001/XMLSchema" xmlns:xs="http://www.w3.org/2001/XMLSchema" xmlns:p="http://schemas.microsoft.com/office/2006/metadata/properties" xmlns:ns2="071933db-0376-4694-9786-b56cb37c4ec2" targetNamespace="http://schemas.microsoft.com/office/2006/metadata/properties" ma:root="true" ma:fieldsID="d5c90ae6c1ec6ed317c9f5feddaf7a33" ns2:_="">
     <xsd:import namespace="071933db-0376-4694-9786-b56cb37c4ec2"/>
@@ -25660,12 +25748,6 @@
 </ct:contentTypeSchema>
 </file>
 
-<file path=customXml/item3.xml><?xml version="1.0" encoding="utf-8"?>
-<p:properties xmlns:p="http://schemas.microsoft.com/office/2006/metadata/properties" xmlns:xsi="http://www.w3.org/2001/XMLSchema-instance" xmlns:pc="http://schemas.microsoft.com/office/infopath/2007/PartnerControls">
-  <documentManagement/>
-</p:properties>
-</file>
-
 <file path=customXml/itemProps1.xml><?xml version="1.0" encoding="utf-8"?>
 <ds:datastoreItem xmlns:ds="http://schemas.openxmlformats.org/officeDocument/2006/customXml" ds:itemID="{F6194C16-5FE5-4670-BEC8-3D6DD9380312}">
   <ds:schemaRefs>
@@ -25675,6 +25757,15 @@
 </file>
 
 <file path=customXml/itemProps2.xml><?xml version="1.0" encoding="utf-8"?>
+<ds:datastoreItem xmlns:ds="http://schemas.openxmlformats.org/officeDocument/2006/customXml" ds:itemID="{2C36E056-BA2C-4A1F-9580-242C9B36FE70}">
+  <ds:schemaRefs>
+    <ds:schemaRef ds:uri="http://schemas.microsoft.com/office/2006/metadata/properties"/>
+    <ds:schemaRef ds:uri="http://schemas.microsoft.com/office/infopath/2007/PartnerControls"/>
+  </ds:schemaRefs>
+</ds:datastoreItem>
+</file>
+
+<file path=customXml/itemProps3.xml><?xml version="1.0" encoding="utf-8"?>
 <ds:datastoreItem xmlns:ds="http://schemas.openxmlformats.org/officeDocument/2006/customXml" ds:itemID="{5C3A06EC-DC03-4D65-AA15-C6B9D68C1ED0}">
   <ds:schemaRefs>
     <ds:schemaRef ds:uri="http://schemas.microsoft.com/office/2006/metadata/contentType"/>
@@ -25690,13 +25781,4 @@
     <ds:schemaRef ds:uri="http://schemas.microsoft.com/internal/obd"/>
   </ds:schemaRefs>
 </ds:datastoreItem>
-</file>
-
-<file path=customXml/itemProps3.xml><?xml version="1.0" encoding="utf-8"?>
-<ds:datastoreItem xmlns:ds="http://schemas.openxmlformats.org/officeDocument/2006/customXml" ds:itemID="{2C36E056-BA2C-4A1F-9580-242C9B36FE70}">
-  <ds:schemaRefs>
-    <ds:schemaRef ds:uri="http://schemas.microsoft.com/office/2006/metadata/properties"/>
-    <ds:schemaRef ds:uri="http://schemas.microsoft.com/office/infopath/2007/PartnerControls"/>
-  </ds:schemaRefs>
-</ds:datastoreItem>
 </file>
</xml_diff>